<commit_message>
Add five HIV/ART curves; reframe around measured dropout-hazard shape
Digitize three further published HIV/ART retention curves (Maputo ATT/BTT
PMC13037074, Malawi pre-intervention PMC13191892, Gambella youth PMC12903592)
via scripts/digitize.py and add all four series to the fit/figure/manuscript
pipeline (no hardcoded values; make regenerates everything).

Expanded evidence shows hazard-shape heterogeneity WITHIN HIV as well as within
TB (k 0.44-1.86; 4 IFR, 4 DFR), so the earlier 'comparators uniformly DFR'
framing no longer holds. Manuscript rewritten around: dropout timing must be
measured (Weibull shape), not assumed/intuited; this also makes intervention
effects verifiable; current open data too sparse for definitive patterns.

Co-Authored-By: Tatsuki Onishi <bougtoir@gmail.com>
</commit_message>
<xml_diff>
--- a/weibull-clinical-dropout/reanalysis_real/manuscript/cover_letter.docx
+++ b/weibull-clinical-dropout/reanalysis_real/manuscript/cover_letter.docx
@@ -15,7 +15,7 @@
         <w:spacing w:before="240"/>
       </w:pPr>
       <w:r>
-        <w:t>Prof. Xiao-Nong Zhou, Editor-in-Chief</w:t>
+        <w:t>The Editors</w:t>
       </w:r>
     </w:p>
     <w:p>
@@ -23,7 +23,7 @@
         <w:spacing w:before="40"/>
       </w:pPr>
       <w:r>
-        <w:t>Infectious Diseases of Poverty</w:t>
+        <w:t>Tropical Medicine &amp; International Health</w:t>
       </w:r>
     </w:p>
     <w:p>
@@ -31,7 +31,7 @@
         <w:spacing w:before="240"/>
       </w:pPr>
       <w:r>
-        <w:t>Dear Professor Zhou and Editors,</w:t>
+        <w:t>Dear Editors,</w:t>
       </w:r>
     </w:p>
     <w:p>
@@ -39,7 +39,7 @@
         <w:spacing w:before="160"/>
       </w:pPr>
       <w:r>
-        <w:t>Please consider our Brief Report, “Divergent hazard shapes of tuberculosis treatment loss to follow-up: a reproducible analysis of published curves quantifying the heterogeneity that hinders a unified retention intervention”, for publication in Infectious Diseases of Poverty.</w:t>
+        <w:t>Please consider our Short Communication, “Heterogeneous hazard shapes of treatment loss to follow-up across tuberculosis and HIV cohorts: a reproducible analysis of published curves and the case for measuring dropout timing rather than assuming it”, for publication in Tropical Medicine &amp; International Health.</w:t>
       </w:r>
     </w:p>
     <w:p>
@@ -47,7 +47,7 @@
         <w:spacing w:before="160"/>
       </w:pPr>
       <w:r>
-        <w:t>Loss to follow-up (LTFU) during tuberculosis (TB) treatment is a central obstacle to cure and transmission control in resource-limited, high-burden settings. It is already recognized that the determinants of treatment interruption are context-dependent and that adherence interventions transfer poorly between programmes, but this has remained a qualitative observation. We give it a quantitative handle by asking whether the timing of LTFU — its hazard shape — is consistent across settings. Fitting Weibull cumulative-incidence models to real, published time-to-event curves, we find that two TB cohorts fall on opposite sides of a constant hazard (one increasing, one decreasing), whereas two unrelated chronic-treatment comparators are mutually consistent. This offers a compact, reproducible explanation for why pooled TB evidence and a single unified retention strategy are hard to build, and it argues for routinely reporting the time-to-LTFU curve so programmes can time adherence support to their own hazard shape.</w:t>
+        <w:t>Loss to follow-up (LTFU) during tuberculosis (TB) and HIV treatment is a central obstacle to cure, viral suppression and transmission control in resource-limited, high-burden settings. It is already recognized that the determinants of treatment interruption are context-dependent and that adherence interventions transfer poorly between programmes, but retention support is still often chosen by intuition rather than matched to when patients actually disengage. We give this a quantitative handle by asking whether the timing of LTFU — its Weibull hazard shape — is consistent within and across diseases. Fitting cumulative-incidence models to eight real, published time-to-event curves, we find that the two TB cohorts and the HIV/ART cohorts each split between increasing- and decreasing-hazard shapes, so there is no characteristic shape even within one disease. The practical message is that retention support should be timed to each setting's measured dropout hazard — which also makes its effect verifiable — and that routinely reporting time-to-LTFU curves is needed before disease-specific patterns can be established.</w:t>
       </w:r>
     </w:p>
     <w:p>
@@ -55,7 +55,7 @@
         <w:spacing w:before="160"/>
       </w:pPr>
       <w:r>
-        <w:t>We believe this fits the scope of Infectious Diseases of Poverty: it addresses treatment and case management of a major infectious disease of poverty, has direct implications for TB programme implementation and health systems, and is fully reproducible — all source figures, digitized data and analysis code that regenerate every reported number are openly available. The work is original, is not under consideration elsewhere, and all authors approve the submission. We declare no competing interests.</w:t>
+        <w:t>We believe this fits the scope of Tropical Medicine &amp; International Health: it addresses treatment retention and case management of two major infectious diseases in resource-limited settings, has direct implications for programme implementation and health systems, and is fully reproducible — all source figures, digitized data and analysis code that regenerate every reported number are openly available. The work is original, is not under consideration elsewhere, and all authors approve the submission. We declare no competing interests.</w:t>
       </w:r>
     </w:p>
     <w:p>

</xml_diff>

<commit_message>
weibull: reframe as reproducible scoping study (Europe PMC search, eligibility=digitizable dropout curve); 7 infectious curves; heterogeneous hazard shapes within TB and HIV
Co-Authored-By: Tatsuki Onishi <bougtoir@gmail.com>
</commit_message>
<xml_diff>
--- a/weibull-clinical-dropout/reanalysis_real/manuscript/cover_letter.docx
+++ b/weibull-clinical-dropout/reanalysis_real/manuscript/cover_letter.docx
@@ -39,7 +39,7 @@
         <w:spacing w:before="160"/>
       </w:pPr>
       <w:r>
-        <w:t>Please consider our Short Communication, “Heterogeneous hazard shapes of treatment loss to follow-up across tuberculosis and HIV cohorts: a reproducible analysis of published curves and the case for measuring dropout timing rather than assuming it”, for publication in Tropical Medicine &amp; International Health.</w:t>
+        <w:t>Please consider our Short Communication (scoping study), “Reproducibly digitizable dropout curves are scarce and their hazard shapes heterogeneous: a scoping search and Weibull analysis of loss to follow-up in tuberculosis and HIV treatment”, for publication in Tropical Medicine &amp; International Health.</w:t>
       </w:r>
     </w:p>
     <w:p>
@@ -47,7 +47,7 @@
         <w:spacing w:before="160"/>
       </w:pPr>
       <w:r>
-        <w:t>Loss to follow-up (LTFU) during tuberculosis (TB) and HIV treatment is a central obstacle to cure, viral suppression and transmission control in resource-limited, high-burden settings. It is already recognized that the determinants of treatment interruption are context-dependent and that adherence interventions transfer poorly between programmes, but retention support is still often chosen by intuition rather than matched to when patients actually disengage. We give this a quantitative handle by asking whether the timing of LTFU — its Weibull hazard shape — is consistent within and across diseases. Fitting cumulative-incidence models to eight real, published time-to-event curves, we find that the two TB cohorts and the HIV/ART cohorts each split between increasing- and decreasing-hazard shapes, so there is no characteristic shape even within one disease. The practical message is that retention support should be timed to each setting's measured dropout hazard — which also makes its effect verifiable — and that routinely reporting time-to-LTFU curves is needed before disease-specific patterns can be established.</w:t>
+        <w:t>Loss to follow-up (LTFU) during tuberculosis (TB) and HIV treatment is a central obstacle to cure, viral suppression and transmission control in resource-limited, high-burden settings. It is already recognized that the determinants of treatment interruption are context-dependent and that adherence interventions transfer poorly between programmes, but retention support is still often chosen by intuition rather than matched to when patients actually disengage. Making such timing decisions requires the dropout curve to be recoverable from the literature, so we ran a reproducible search with an unusual eligibility criterion — that a study make dropout visible over time in a digitizable curve, not merely a final proportion. Two findings follow: such curves are scarce (only seven infectious-disease curves from six studies out of thousands of records), and where they exist the two TB cohorts and the HIV/ART cohorts each split between increasing- and decreasing-hazard shapes, so there is no characteristic shape even within one disease. The practical message is that retention support should be timed to each setting's measured dropout hazard — which also makes its effect verifiable — and that routinely reporting time-to-LTFU curves is needed before disease-specific patterns can be established.</w:t>
       </w:r>
     </w:p>
     <w:p>

</xml_diff>